<commit_message>
Add Word versions of the assessment solutions and EDA report
Co-Authored-By: Claude Fable 5.1 <noreply@anthropic.com>
Claude-Session: https://claude.ai/code/session_01VSxQY4zC3ss8v2MbXjeYwJ
</commit_message>
<xml_diff>
--- a/Assessment_Solutions/EDA/EDA_Report.docx
+++ b/Assessment_Solutions/EDA/EDA_Report.docx
@@ -88,7 +88,7 @@
     </w:p>
     <w:tbl>
       <w:tblPr>
-        <w:tblStyle w:val="LightGrid-Accent1"/>
+        <w:tblStyle w:val="TableGrid"/>
         <w:tblW w:type="auto" w:w="0"/>
         <w:tblLook w:firstColumn="1" w:firstRow="1" w:lastColumn="0" w:lastRow="0" w:noHBand="0" w:noVBand="1" w:val="04A0"/>
       </w:tblPr>
@@ -101,12 +101,14 @@
         <w:tc>
           <w:tcPr>
             <w:tcW w:type="dxa" w:w="3216"/>
+            <w:shd w:val="clear" w:color="auto" w:fill="2E5A88"/>
           </w:tcPr>
           <w:p>
             <w:r/>
             <w:r>
               <w:rPr>
                 <w:b/>
+                <w:color w:val="FFFFFF"/>
                 <w:sz w:val="20"/>
               </w:rPr>
               <w:t>Variable</w:t>
@@ -116,12 +118,14 @@
         <w:tc>
           <w:tcPr>
             <w:tcW w:type="dxa" w:w="3216"/>
+            <w:shd w:val="clear" w:color="auto" w:fill="2E5A88"/>
           </w:tcPr>
           <w:p>
             <w:r/>
             <w:r>
               <w:rPr>
                 <w:b/>
+                <w:color w:val="FFFFFF"/>
                 <w:sz w:val="20"/>
               </w:rPr>
               <w:t>Meaning</w:t>
@@ -131,12 +135,14 @@
         <w:tc>
           <w:tcPr>
             <w:tcW w:type="dxa" w:w="3216"/>
+            <w:shd w:val="clear" w:color="auto" w:fill="2E5A88"/>
           </w:tcPr>
           <w:p>
             <w:r/>
             <w:r>
               <w:rPr>
                 <w:b/>
+                <w:color w:val="FFFFFF"/>
                 <w:sz w:val="20"/>
               </w:rPr>
               <w:t>Type in practice</w:t>
@@ -204,6 +210,7 @@
         <w:tc>
           <w:tcPr>
             <w:tcW w:type="dxa" w:w="3216"/>
+            <w:shd w:val="clear" w:color="auto" w:fill="F2F5F9"/>
           </w:tcPr>
           <w:p>
             <w:r>
@@ -222,6 +229,7 @@
         <w:tc>
           <w:tcPr>
             <w:tcW w:type="dxa" w:w="3216"/>
+            <w:shd w:val="clear" w:color="auto" w:fill="F2F5F9"/>
           </w:tcPr>
           <w:p>
             <w:r>
@@ -240,6 +248,7 @@
         <w:tc>
           <w:tcPr>
             <w:tcW w:type="dxa" w:w="3216"/>
+            <w:shd w:val="clear" w:color="auto" w:fill="F2F5F9"/>
           </w:tcPr>
           <w:p>
             <w:r>
@@ -316,6 +325,7 @@
         <w:tc>
           <w:tcPr>
             <w:tcW w:type="dxa" w:w="3216"/>
+            <w:shd w:val="clear" w:color="auto" w:fill="F2F5F9"/>
           </w:tcPr>
           <w:p>
             <w:r>
@@ -334,6 +344,7 @@
         <w:tc>
           <w:tcPr>
             <w:tcW w:type="dxa" w:w="3216"/>
+            <w:shd w:val="clear" w:color="auto" w:fill="F2F5F9"/>
           </w:tcPr>
           <w:p>
             <w:r>
@@ -352,6 +363,7 @@
         <w:tc>
           <w:tcPr>
             <w:tcW w:type="dxa" w:w="3216"/>
+            <w:shd w:val="clear" w:color="auto" w:fill="F2F5F9"/>
           </w:tcPr>
           <w:p>
             <w:r>
@@ -428,6 +440,7 @@
         <w:tc>
           <w:tcPr>
             <w:tcW w:type="dxa" w:w="3216"/>
+            <w:shd w:val="clear" w:color="auto" w:fill="F2F5F9"/>
           </w:tcPr>
           <w:p>
             <w:r>
@@ -446,6 +459,7 @@
         <w:tc>
           <w:tcPr>
             <w:tcW w:type="dxa" w:w="3216"/>
+            <w:shd w:val="clear" w:color="auto" w:fill="F2F5F9"/>
           </w:tcPr>
           <w:p>
             <w:r>
@@ -464,6 +478,7 @@
         <w:tc>
           <w:tcPr>
             <w:tcW w:type="dxa" w:w="3216"/>
+            <w:shd w:val="clear" w:color="auto" w:fill="F2F5F9"/>
           </w:tcPr>
           <w:p>
             <w:r>
@@ -540,6 +555,7 @@
         <w:tc>
           <w:tcPr>
             <w:tcW w:type="dxa" w:w="3216"/>
+            <w:shd w:val="clear" w:color="auto" w:fill="F2F5F9"/>
           </w:tcPr>
           <w:p>
             <w:r>
@@ -558,6 +574,7 @@
         <w:tc>
           <w:tcPr>
             <w:tcW w:type="dxa" w:w="3216"/>
+            <w:shd w:val="clear" w:color="auto" w:fill="F2F5F9"/>
           </w:tcPr>
           <w:p>
             <w:r>
@@ -576,6 +593,7 @@
         <w:tc>
           <w:tcPr>
             <w:tcW w:type="dxa" w:w="3216"/>
+            <w:shd w:val="clear" w:color="auto" w:fill="F2F5F9"/>
           </w:tcPr>
           <w:p>
             <w:r>
@@ -652,6 +670,7 @@
         <w:tc>
           <w:tcPr>
             <w:tcW w:type="dxa" w:w="3216"/>
+            <w:shd w:val="clear" w:color="auto" w:fill="F2F5F9"/>
           </w:tcPr>
           <w:p>
             <w:r>
@@ -670,6 +689,7 @@
         <w:tc>
           <w:tcPr>
             <w:tcW w:type="dxa" w:w="3216"/>
+            <w:shd w:val="clear" w:color="auto" w:fill="F2F5F9"/>
           </w:tcPr>
           <w:p>
             <w:r>
@@ -688,6 +708,7 @@
         <w:tc>
           <w:tcPr>
             <w:tcW w:type="dxa" w:w="3216"/>
+            <w:shd w:val="clear" w:color="auto" w:fill="F2F5F9"/>
           </w:tcPr>
           <w:p>
             <w:r>
@@ -841,7 +862,7 @@
     </w:p>
     <w:tbl>
       <w:tblPr>
-        <w:tblStyle w:val="LightGrid-Accent1"/>
+        <w:tblStyle w:val="TableGrid"/>
         <w:tblW w:type="auto" w:w="0"/>
         <w:tblLook w:firstColumn="1" w:firstRow="1" w:lastColumn="0" w:lastRow="0" w:noHBand="0" w:noVBand="1" w:val="04A0"/>
       </w:tblPr>
@@ -859,12 +880,14 @@
         <w:tc>
           <w:tcPr>
             <w:tcW w:type="dxa" w:w="1206"/>
+            <w:shd w:val="clear" w:color="auto" w:fill="2E5A88"/>
           </w:tcPr>
           <w:p>
             <w:r/>
             <w:r>
               <w:rPr>
                 <w:b/>
+                <w:color w:val="FFFFFF"/>
                 <w:sz w:val="20"/>
               </w:rPr>
               <w:t>Variable</w:t>
@@ -874,12 +897,14 @@
         <w:tc>
           <w:tcPr>
             <w:tcW w:type="dxa" w:w="1206"/>
+            <w:shd w:val="clear" w:color="auto" w:fill="2E5A88"/>
           </w:tcPr>
           <w:p>
             <w:r/>
             <w:r>
               <w:rPr>
                 <w:b/>
+                <w:color w:val="FFFFFF"/>
                 <w:sz w:val="20"/>
               </w:rPr>
               <w:t>Mean</w:t>
@@ -889,12 +914,14 @@
         <w:tc>
           <w:tcPr>
             <w:tcW w:type="dxa" w:w="1206"/>
+            <w:shd w:val="clear" w:color="auto" w:fill="2E5A88"/>
           </w:tcPr>
           <w:p>
             <w:r/>
             <w:r>
               <w:rPr>
                 <w:b/>
+                <w:color w:val="FFFFFF"/>
                 <w:sz w:val="20"/>
               </w:rPr>
               <w:t>SD</w:t>
@@ -904,12 +931,14 @@
         <w:tc>
           <w:tcPr>
             <w:tcW w:type="dxa" w:w="1206"/>
+            <w:shd w:val="clear" w:color="auto" w:fill="2E5A88"/>
           </w:tcPr>
           <w:p>
             <w:r/>
             <w:r>
               <w:rPr>
                 <w:b/>
+                <w:color w:val="FFFFFF"/>
                 <w:sz w:val="20"/>
               </w:rPr>
               <w:t>Min</w:t>
@@ -919,12 +948,14 @@
         <w:tc>
           <w:tcPr>
             <w:tcW w:type="dxa" w:w="1206"/>
+            <w:shd w:val="clear" w:color="auto" w:fill="2E5A88"/>
           </w:tcPr>
           <w:p>
             <w:r/>
             <w:r>
               <w:rPr>
                 <w:b/>
+                <w:color w:val="FFFFFF"/>
                 <w:sz w:val="20"/>
               </w:rPr>
               <w:t>Median</w:t>
@@ -934,12 +965,14 @@
         <w:tc>
           <w:tcPr>
             <w:tcW w:type="dxa" w:w="1206"/>
+            <w:shd w:val="clear" w:color="auto" w:fill="2E5A88"/>
           </w:tcPr>
           <w:p>
             <w:r/>
             <w:r>
               <w:rPr>
                 <w:b/>
+                <w:color w:val="FFFFFF"/>
                 <w:sz w:val="20"/>
               </w:rPr>
               <w:t>Max</w:t>
@@ -949,12 +982,14 @@
         <w:tc>
           <w:tcPr>
             <w:tcW w:type="dxa" w:w="1206"/>
+            <w:shd w:val="clear" w:color="auto" w:fill="2E5A88"/>
           </w:tcPr>
           <w:p>
             <w:r/>
             <w:r>
               <w:rPr>
                 <w:b/>
+                <w:color w:val="FFFFFF"/>
                 <w:sz w:val="20"/>
               </w:rPr>
               <w:t>Skew</w:t>
@@ -964,12 +999,14 @@
         <w:tc>
           <w:tcPr>
             <w:tcW w:type="dxa" w:w="1206"/>
+            <w:shd w:val="clear" w:color="auto" w:fill="2E5A88"/>
           </w:tcPr>
           <w:p>
             <w:r/>
             <w:r>
               <w:rPr>
                 <w:b/>
+                <w:color w:val="FFFFFF"/>
                 <w:sz w:val="20"/>
               </w:rPr>
               <w:t>CV %</w:t>
@@ -1127,6 +1164,7 @@
         <w:tc>
           <w:tcPr>
             <w:tcW w:type="dxa" w:w="1206"/>
+            <w:shd w:val="clear" w:color="auto" w:fill="F2F5F9"/>
           </w:tcPr>
           <w:p>
             <w:r>
@@ -1145,6 +1183,7 @@
         <w:tc>
           <w:tcPr>
             <w:tcW w:type="dxa" w:w="1206"/>
+            <w:shd w:val="clear" w:color="auto" w:fill="F2F5F9"/>
           </w:tcPr>
           <w:p>
             <w:r>
@@ -1163,6 +1202,7 @@
         <w:tc>
           <w:tcPr>
             <w:tcW w:type="dxa" w:w="1206"/>
+            <w:shd w:val="clear" w:color="auto" w:fill="F2F5F9"/>
           </w:tcPr>
           <w:p>
             <w:r>
@@ -1181,6 +1221,7 @@
         <w:tc>
           <w:tcPr>
             <w:tcW w:type="dxa" w:w="1206"/>
+            <w:shd w:val="clear" w:color="auto" w:fill="F2F5F9"/>
           </w:tcPr>
           <w:p>
             <w:r>
@@ -1199,6 +1240,7 @@
         <w:tc>
           <w:tcPr>
             <w:tcW w:type="dxa" w:w="1206"/>
+            <w:shd w:val="clear" w:color="auto" w:fill="F2F5F9"/>
           </w:tcPr>
           <w:p>
             <w:r>
@@ -1217,6 +1259,7 @@
         <w:tc>
           <w:tcPr>
             <w:tcW w:type="dxa" w:w="1206"/>
+            <w:shd w:val="clear" w:color="auto" w:fill="F2F5F9"/>
           </w:tcPr>
           <w:p>
             <w:r>
@@ -1235,6 +1278,7 @@
         <w:tc>
           <w:tcPr>
             <w:tcW w:type="dxa" w:w="1206"/>
+            <w:shd w:val="clear" w:color="auto" w:fill="F2F5F9"/>
           </w:tcPr>
           <w:p>
             <w:r>
@@ -1253,6 +1297,7 @@
         <w:tc>
           <w:tcPr>
             <w:tcW w:type="dxa" w:w="1206"/>
+            <w:shd w:val="clear" w:color="auto" w:fill="F2F5F9"/>
           </w:tcPr>
           <w:p>
             <w:r>
@@ -1419,6 +1464,7 @@
         <w:tc>
           <w:tcPr>
             <w:tcW w:type="dxa" w:w="1206"/>
+            <w:shd w:val="clear" w:color="auto" w:fill="F2F5F9"/>
           </w:tcPr>
           <w:p>
             <w:r>
@@ -1437,6 +1483,7 @@
         <w:tc>
           <w:tcPr>
             <w:tcW w:type="dxa" w:w="1206"/>
+            <w:shd w:val="clear" w:color="auto" w:fill="F2F5F9"/>
           </w:tcPr>
           <w:p>
             <w:r>
@@ -1455,6 +1502,7 @@
         <w:tc>
           <w:tcPr>
             <w:tcW w:type="dxa" w:w="1206"/>
+            <w:shd w:val="clear" w:color="auto" w:fill="F2F5F9"/>
           </w:tcPr>
           <w:p>
             <w:r>
@@ -1473,6 +1521,7 @@
         <w:tc>
           <w:tcPr>
             <w:tcW w:type="dxa" w:w="1206"/>
+            <w:shd w:val="clear" w:color="auto" w:fill="F2F5F9"/>
           </w:tcPr>
           <w:p>
             <w:r>
@@ -1491,6 +1540,7 @@
         <w:tc>
           <w:tcPr>
             <w:tcW w:type="dxa" w:w="1206"/>
+            <w:shd w:val="clear" w:color="auto" w:fill="F2F5F9"/>
           </w:tcPr>
           <w:p>
             <w:r>
@@ -1509,6 +1559,7 @@
         <w:tc>
           <w:tcPr>
             <w:tcW w:type="dxa" w:w="1206"/>
+            <w:shd w:val="clear" w:color="auto" w:fill="F2F5F9"/>
           </w:tcPr>
           <w:p>
             <w:r>
@@ -1527,6 +1578,7 @@
         <w:tc>
           <w:tcPr>
             <w:tcW w:type="dxa" w:w="1206"/>
+            <w:shd w:val="clear" w:color="auto" w:fill="F2F5F9"/>
           </w:tcPr>
           <w:p>
             <w:r>
@@ -1545,6 +1597,7 @@
         <w:tc>
           <w:tcPr>
             <w:tcW w:type="dxa" w:w="1206"/>
+            <w:shd w:val="clear" w:color="auto" w:fill="F2F5F9"/>
           </w:tcPr>
           <w:p>
             <w:r>
@@ -1711,6 +1764,7 @@
         <w:tc>
           <w:tcPr>
             <w:tcW w:type="dxa" w:w="1206"/>
+            <w:shd w:val="clear" w:color="auto" w:fill="F2F5F9"/>
           </w:tcPr>
           <w:p>
             <w:r>
@@ -1729,6 +1783,7 @@
         <w:tc>
           <w:tcPr>
             <w:tcW w:type="dxa" w:w="1206"/>
+            <w:shd w:val="clear" w:color="auto" w:fill="F2F5F9"/>
           </w:tcPr>
           <w:p>
             <w:r>
@@ -1747,6 +1802,7 @@
         <w:tc>
           <w:tcPr>
             <w:tcW w:type="dxa" w:w="1206"/>
+            <w:shd w:val="clear" w:color="auto" w:fill="F2F5F9"/>
           </w:tcPr>
           <w:p>
             <w:r>
@@ -1765,6 +1821,7 @@
         <w:tc>
           <w:tcPr>
             <w:tcW w:type="dxa" w:w="1206"/>
+            <w:shd w:val="clear" w:color="auto" w:fill="F2F5F9"/>
           </w:tcPr>
           <w:p>
             <w:r>
@@ -1783,6 +1840,7 @@
         <w:tc>
           <w:tcPr>
             <w:tcW w:type="dxa" w:w="1206"/>
+            <w:shd w:val="clear" w:color="auto" w:fill="F2F5F9"/>
           </w:tcPr>
           <w:p>
             <w:r>
@@ -1801,6 +1859,7 @@
         <w:tc>
           <w:tcPr>
             <w:tcW w:type="dxa" w:w="1206"/>
+            <w:shd w:val="clear" w:color="auto" w:fill="F2F5F9"/>
           </w:tcPr>
           <w:p>
             <w:r>
@@ -1819,6 +1878,7 @@
         <w:tc>
           <w:tcPr>
             <w:tcW w:type="dxa" w:w="1206"/>
+            <w:shd w:val="clear" w:color="auto" w:fill="F2F5F9"/>
           </w:tcPr>
           <w:p>
             <w:r>
@@ -1837,6 +1897,7 @@
         <w:tc>
           <w:tcPr>
             <w:tcW w:type="dxa" w:w="1206"/>
+            <w:shd w:val="clear" w:color="auto" w:fill="F2F5F9"/>
           </w:tcPr>
           <w:p>
             <w:r>
@@ -1948,7 +2009,7 @@
     </w:p>
     <w:tbl>
       <w:tblPr>
-        <w:tblStyle w:val="LightGrid-Accent1"/>
+        <w:tblStyle w:val="TableGrid"/>
         <w:tblW w:type="auto" w:w="0"/>
         <w:tblLook w:firstColumn="1" w:firstRow="1" w:lastColumn="0" w:lastRow="0" w:noHBand="0" w:noVBand="1" w:val="04A0"/>
       </w:tblPr>
@@ -1960,12 +2021,14 @@
         <w:tc>
           <w:tcPr>
             <w:tcW w:type="dxa" w:w="4824"/>
+            <w:shd w:val="clear" w:color="auto" w:fill="2E5A88"/>
           </w:tcPr>
           <w:p>
             <w:r/>
             <w:r>
               <w:rPr>
                 <w:b/>
+                <w:color w:val="FFFFFF"/>
                 <w:sz w:val="20"/>
               </w:rPr>
               <w:t>Variable</w:t>
@@ -1975,12 +2038,14 @@
         <w:tc>
           <w:tcPr>
             <w:tcW w:type="dxa" w:w="4824"/>
+            <w:shd w:val="clear" w:color="auto" w:fill="2E5A88"/>
           </w:tcPr>
           <w:p>
             <w:r/>
             <w:r>
               <w:rPr>
                 <w:b/>
+                <w:color w:val="FFFFFF"/>
                 <w:sz w:val="20"/>
               </w:rPr>
               <w:t>Outlier car(s)</w:t>
@@ -2030,6 +2095,7 @@
         <w:tc>
           <w:tcPr>
             <w:tcW w:type="dxa" w:w="4824"/>
+            <w:shd w:val="clear" w:color="auto" w:fill="F2F5F9"/>
           </w:tcPr>
           <w:p>
             <w:r>
@@ -2048,6 +2114,7 @@
         <w:tc>
           <w:tcPr>
             <w:tcW w:type="dxa" w:w="4824"/>
+            <w:shd w:val="clear" w:color="auto" w:fill="F2F5F9"/>
           </w:tcPr>
           <w:p>
             <w:r>
@@ -2106,6 +2173,7 @@
         <w:tc>
           <w:tcPr>
             <w:tcW w:type="dxa" w:w="4824"/>
+            <w:shd w:val="clear" w:color="auto" w:fill="F2F5F9"/>
           </w:tcPr>
           <w:p>
             <w:r>
@@ -2124,6 +2192,7 @@
         <w:tc>
           <w:tcPr>
             <w:tcW w:type="dxa" w:w="4824"/>
+            <w:shd w:val="clear" w:color="auto" w:fill="F2F5F9"/>
           </w:tcPr>
           <w:p>
             <w:r>
@@ -2227,7 +2296,7 @@
     </w:p>
     <w:tbl>
       <w:tblPr>
-        <w:tblStyle w:val="LightGrid-Accent1"/>
+        <w:tblStyle w:val="TableGrid"/>
         <w:tblW w:type="auto" w:w="0"/>
         <w:tblLook w:firstColumn="1" w:firstRow="1" w:lastColumn="0" w:lastRow="0" w:noHBand="0" w:noVBand="1" w:val="04A0"/>
       </w:tblPr>
@@ -2239,12 +2308,14 @@
         <w:tc>
           <w:tcPr>
             <w:tcW w:type="dxa" w:w="4824"/>
+            <w:shd w:val="clear" w:color="auto" w:fill="2E5A88"/>
           </w:tcPr>
           <w:p>
             <w:r/>
             <w:r>
               <w:rPr>
                 <w:b/>
+                <w:color w:val="FFFFFF"/>
                 <w:sz w:val="20"/>
               </w:rPr>
               <w:t>Variable</w:t>
@@ -2254,12 +2325,14 @@
         <w:tc>
           <w:tcPr>
             <w:tcW w:type="dxa" w:w="4824"/>
+            <w:shd w:val="clear" w:color="auto" w:fill="2E5A88"/>
           </w:tcPr>
           <w:p>
             <w:r/>
             <w:r>
               <w:rPr>
                 <w:b/>
+                <w:color w:val="FFFFFF"/>
                 <w:sz w:val="20"/>
               </w:rPr>
               <w:t>Level counts (percent)</w:t>
@@ -2309,6 +2382,7 @@
         <w:tc>
           <w:tcPr>
             <w:tcW w:type="dxa" w:w="4824"/>
+            <w:shd w:val="clear" w:color="auto" w:fill="F2F5F9"/>
           </w:tcPr>
           <w:p>
             <w:r>
@@ -2327,6 +2401,7 @@
         <w:tc>
           <w:tcPr>
             <w:tcW w:type="dxa" w:w="4824"/>
+            <w:shd w:val="clear" w:color="auto" w:fill="F2F5F9"/>
           </w:tcPr>
           <w:p>
             <w:r>
@@ -2385,6 +2460,7 @@
         <w:tc>
           <w:tcPr>
             <w:tcW w:type="dxa" w:w="4824"/>
+            <w:shd w:val="clear" w:color="auto" w:fill="F2F5F9"/>
           </w:tcPr>
           <w:p>
             <w:r>
@@ -2403,6 +2479,7 @@
         <w:tc>
           <w:tcPr>
             <w:tcW w:type="dxa" w:w="4824"/>
+            <w:shd w:val="clear" w:color="auto" w:fill="F2F5F9"/>
           </w:tcPr>
           <w:p>
             <w:r>
@@ -2571,7 +2648,7 @@
     </w:p>
     <w:tbl>
       <w:tblPr>
-        <w:tblStyle w:val="LightGrid-Accent1"/>
+        <w:tblStyle w:val="TableGrid"/>
         <w:tblW w:type="auto" w:w="0"/>
         <w:tblLook w:firstColumn="1" w:firstRow="1" w:lastColumn="0" w:lastRow="0" w:noHBand="0" w:noVBand="1" w:val="04A0"/>
       </w:tblPr>
@@ -2583,12 +2660,14 @@
         <w:tc>
           <w:tcPr>
             <w:tcW w:type="dxa" w:w="4824"/>
+            <w:shd w:val="clear" w:color="auto" w:fill="2E5A88"/>
           </w:tcPr>
           <w:p>
             <w:r/>
             <w:r>
               <w:rPr>
                 <w:b/>
+                <w:color w:val="FFFFFF"/>
                 <w:sz w:val="20"/>
               </w:rPr>
               <w:t>Variable</w:t>
@@ -2598,12 +2677,14 @@
         <w:tc>
           <w:tcPr>
             <w:tcW w:type="dxa" w:w="4824"/>
+            <w:shd w:val="clear" w:color="auto" w:fill="2E5A88"/>
           </w:tcPr>
           <w:p>
             <w:r/>
             <w:r>
               <w:rPr>
                 <w:b/>
+                <w:color w:val="FFFFFF"/>
                 <w:sz w:val="20"/>
               </w:rPr>
               <w:t>r with mpg</w:t>
@@ -2653,6 +2734,7 @@
         <w:tc>
           <w:tcPr>
             <w:tcW w:type="dxa" w:w="4824"/>
+            <w:shd w:val="clear" w:color="auto" w:fill="F2F5F9"/>
           </w:tcPr>
           <w:p>
             <w:r>
@@ -2671,6 +2753,7 @@
         <w:tc>
           <w:tcPr>
             <w:tcW w:type="dxa" w:w="4824"/>
+            <w:shd w:val="clear" w:color="auto" w:fill="F2F5F9"/>
           </w:tcPr>
           <w:p>
             <w:r>
@@ -2729,6 +2812,7 @@
         <w:tc>
           <w:tcPr>
             <w:tcW w:type="dxa" w:w="4824"/>
+            <w:shd w:val="clear" w:color="auto" w:fill="F2F5F9"/>
           </w:tcPr>
           <w:p>
             <w:r>
@@ -2747,6 +2831,7 @@
         <w:tc>
           <w:tcPr>
             <w:tcW w:type="dxa" w:w="4824"/>
+            <w:shd w:val="clear" w:color="auto" w:fill="F2F5F9"/>
           </w:tcPr>
           <w:p>
             <w:r>
@@ -2805,6 +2890,7 @@
         <w:tc>
           <w:tcPr>
             <w:tcW w:type="dxa" w:w="4824"/>
+            <w:shd w:val="clear" w:color="auto" w:fill="F2F5F9"/>
           </w:tcPr>
           <w:p>
             <w:r>
@@ -2823,6 +2909,7 @@
         <w:tc>
           <w:tcPr>
             <w:tcW w:type="dxa" w:w="4824"/>
+            <w:shd w:val="clear" w:color="auto" w:fill="F2F5F9"/>
           </w:tcPr>
           <w:p>
             <w:r>
@@ -2881,6 +2968,7 @@
         <w:tc>
           <w:tcPr>
             <w:tcW w:type="dxa" w:w="4824"/>
+            <w:shd w:val="clear" w:color="auto" w:fill="F2F5F9"/>
           </w:tcPr>
           <w:p>
             <w:r>
@@ -2899,6 +2987,7 @@
         <w:tc>
           <w:tcPr>
             <w:tcW w:type="dxa" w:w="4824"/>
+            <w:shd w:val="clear" w:color="auto" w:fill="F2F5F9"/>
           </w:tcPr>
           <w:p>
             <w:r>
@@ -2957,6 +3046,7 @@
         <w:tc>
           <w:tcPr>
             <w:tcW w:type="dxa" w:w="4824"/>
+            <w:shd w:val="clear" w:color="auto" w:fill="F2F5F9"/>
           </w:tcPr>
           <w:p>
             <w:r>
@@ -2975,6 +3065,7 @@
         <w:tc>
           <w:tcPr>
             <w:tcW w:type="dxa" w:w="4824"/>
+            <w:shd w:val="clear" w:color="auto" w:fill="F2F5F9"/>
           </w:tcPr>
           <w:p>
             <w:r>
@@ -3105,7 +3196,7 @@
     </w:p>
     <w:tbl>
       <w:tblPr>
-        <w:tblStyle w:val="LightGrid-Accent1"/>
+        <w:tblStyle w:val="TableGrid"/>
         <w:tblW w:type="auto" w:w="0"/>
         <w:tblLook w:firstColumn="1" w:firstRow="1" w:lastColumn="0" w:lastRow="0" w:noHBand="0" w:noVBand="1" w:val="04A0"/>
       </w:tblPr>
@@ -3119,12 +3210,14 @@
         <w:tc>
           <w:tcPr>
             <w:tcW w:type="dxa" w:w="2412"/>
+            <w:shd w:val="clear" w:color="auto" w:fill="2E5A88"/>
           </w:tcPr>
           <w:p>
             <w:r/>
             <w:r>
               <w:rPr>
                 <w:b/>
+                <w:color w:val="FFFFFF"/>
                 <w:sz w:val="20"/>
               </w:rPr>
               <w:t>Group</w:t>
@@ -3134,12 +3227,14 @@
         <w:tc>
           <w:tcPr>
             <w:tcW w:type="dxa" w:w="2412"/>
+            <w:shd w:val="clear" w:color="auto" w:fill="2E5A88"/>
           </w:tcPr>
           <w:p>
             <w:r/>
             <w:r>
               <w:rPr>
                 <w:b/>
+                <w:color w:val="FFFFFF"/>
                 <w:sz w:val="20"/>
               </w:rPr>
               <w:t>Mean mpg</w:t>
@@ -3149,12 +3244,14 @@
         <w:tc>
           <w:tcPr>
             <w:tcW w:type="dxa" w:w="2412"/>
+            <w:shd w:val="clear" w:color="auto" w:fill="2E5A88"/>
           </w:tcPr>
           <w:p>
             <w:r/>
             <w:r>
               <w:rPr>
                 <w:b/>
+                <w:color w:val="FFFFFF"/>
                 <w:sz w:val="20"/>
               </w:rPr>
               <w:t>SD</w:t>
@@ -3164,12 +3261,14 @@
         <w:tc>
           <w:tcPr>
             <w:tcW w:type="dxa" w:w="2412"/>
+            <w:shd w:val="clear" w:color="auto" w:fill="2E5A88"/>
           </w:tcPr>
           <w:p>
             <w:r/>
             <w:r>
               <w:rPr>
                 <w:b/>
+                <w:color w:val="FFFFFF"/>
                 <w:sz w:val="20"/>
               </w:rPr>
               <w:t>n</w:t>
@@ -3255,6 +3354,7 @@
         <w:tc>
           <w:tcPr>
             <w:tcW w:type="dxa" w:w="2412"/>
+            <w:shd w:val="clear" w:color="auto" w:fill="F2F5F9"/>
           </w:tcPr>
           <w:p>
             <w:r>
@@ -3273,6 +3373,7 @@
         <w:tc>
           <w:tcPr>
             <w:tcW w:type="dxa" w:w="2412"/>
+            <w:shd w:val="clear" w:color="auto" w:fill="F2F5F9"/>
           </w:tcPr>
           <w:p>
             <w:r>
@@ -3291,6 +3392,7 @@
         <w:tc>
           <w:tcPr>
             <w:tcW w:type="dxa" w:w="2412"/>
+            <w:shd w:val="clear" w:color="auto" w:fill="F2F5F9"/>
           </w:tcPr>
           <w:p>
             <w:r>
@@ -3309,6 +3411,7 @@
         <w:tc>
           <w:tcPr>
             <w:tcW w:type="dxa" w:w="2412"/>
+            <w:shd w:val="clear" w:color="auto" w:fill="F2F5F9"/>
           </w:tcPr>
           <w:p>
             <w:r>
@@ -3403,6 +3506,7 @@
         <w:tc>
           <w:tcPr>
             <w:tcW w:type="dxa" w:w="2412"/>
+            <w:shd w:val="clear" w:color="auto" w:fill="F2F5F9"/>
           </w:tcPr>
           <w:p>
             <w:r>
@@ -3421,6 +3525,7 @@
         <w:tc>
           <w:tcPr>
             <w:tcW w:type="dxa" w:w="2412"/>
+            <w:shd w:val="clear" w:color="auto" w:fill="F2F5F9"/>
           </w:tcPr>
           <w:p>
             <w:r>
@@ -3439,6 +3544,7 @@
         <w:tc>
           <w:tcPr>
             <w:tcW w:type="dxa" w:w="2412"/>
+            <w:shd w:val="clear" w:color="auto" w:fill="F2F5F9"/>
           </w:tcPr>
           <w:p>
             <w:r>
@@ -3457,6 +3563,7 @@
         <w:tc>
           <w:tcPr>
             <w:tcW w:type="dxa" w:w="2412"/>
+            <w:shd w:val="clear" w:color="auto" w:fill="F2F5F9"/>
           </w:tcPr>
           <w:p>
             <w:r>
@@ -3551,6 +3658,7 @@
         <w:tc>
           <w:tcPr>
             <w:tcW w:type="dxa" w:w="2412"/>
+            <w:shd w:val="clear" w:color="auto" w:fill="F2F5F9"/>
           </w:tcPr>
           <w:p>
             <w:r>
@@ -3569,6 +3677,7 @@
         <w:tc>
           <w:tcPr>
             <w:tcW w:type="dxa" w:w="2412"/>
+            <w:shd w:val="clear" w:color="auto" w:fill="F2F5F9"/>
           </w:tcPr>
           <w:p>
             <w:r>
@@ -3587,6 +3696,7 @@
         <w:tc>
           <w:tcPr>
             <w:tcW w:type="dxa" w:w="2412"/>
+            <w:shd w:val="clear" w:color="auto" w:fill="F2F5F9"/>
           </w:tcPr>
           <w:p>
             <w:r>
@@ -3605,6 +3715,7 @@
         <w:tc>
           <w:tcPr>
             <w:tcW w:type="dxa" w:w="2412"/>
+            <w:shd w:val="clear" w:color="auto" w:fill="F2F5F9"/>
           </w:tcPr>
           <w:p>
             <w:r>
@@ -3699,6 +3810,7 @@
         <w:tc>
           <w:tcPr>
             <w:tcW w:type="dxa" w:w="2412"/>
+            <w:shd w:val="clear" w:color="auto" w:fill="F2F5F9"/>
           </w:tcPr>
           <w:p>
             <w:r>
@@ -3717,6 +3829,7 @@
         <w:tc>
           <w:tcPr>
             <w:tcW w:type="dxa" w:w="2412"/>
+            <w:shd w:val="clear" w:color="auto" w:fill="F2F5F9"/>
           </w:tcPr>
           <w:p>
             <w:r>
@@ -3735,6 +3848,7 @@
         <w:tc>
           <w:tcPr>
             <w:tcW w:type="dxa" w:w="2412"/>
+            <w:shd w:val="clear" w:color="auto" w:fill="F2F5F9"/>
           </w:tcPr>
           <w:p>
             <w:r>
@@ -3753,6 +3867,7 @@
         <w:tc>
           <w:tcPr>
             <w:tcW w:type="dxa" w:w="2412"/>
+            <w:shd w:val="clear" w:color="auto" w:fill="F2F5F9"/>
           </w:tcPr>
           <w:p>
             <w:r>
@@ -3847,6 +3962,7 @@
         <w:tc>
           <w:tcPr>
             <w:tcW w:type="dxa" w:w="2412"/>
+            <w:shd w:val="clear" w:color="auto" w:fill="F2F5F9"/>
           </w:tcPr>
           <w:p>
             <w:r>
@@ -3865,6 +3981,7 @@
         <w:tc>
           <w:tcPr>
             <w:tcW w:type="dxa" w:w="2412"/>
+            <w:shd w:val="clear" w:color="auto" w:fill="F2F5F9"/>
           </w:tcPr>
           <w:p>
             <w:r>
@@ -3883,6 +4000,7 @@
         <w:tc>
           <w:tcPr>
             <w:tcW w:type="dxa" w:w="2412"/>
+            <w:shd w:val="clear" w:color="auto" w:fill="F2F5F9"/>
           </w:tcPr>
           <w:p>
             <w:r>
@@ -3901,6 +4019,7 @@
         <w:tc>
           <w:tcPr>
             <w:tcW w:type="dxa" w:w="2412"/>
+            <w:shd w:val="clear" w:color="auto" w:fill="F2F5F9"/>
           </w:tcPr>
           <w:p>
             <w:r>
@@ -3992,7 +4111,7 @@
     </w:p>
     <w:tbl>
       <w:tblPr>
-        <w:tblStyle w:val="LightGrid-Accent1"/>
+        <w:tblStyle w:val="TableGrid"/>
         <w:tblW w:type="auto" w:w="0"/>
         <w:tblLook w:firstColumn="1" w:firstRow="1" w:lastColumn="0" w:lastRow="0" w:noHBand="0" w:noVBand="1" w:val="04A0"/>
       </w:tblPr>
@@ -4005,12 +4124,14 @@
         <w:tc>
           <w:tcPr>
             <w:tcW w:type="dxa" w:w="3216"/>
+            <w:shd w:val="clear" w:color="auto" w:fill="2E5A88"/>
           </w:tcPr>
           <w:p>
             <w:r/>
             <w:r>
               <w:rPr>
                 <w:b/>
+                <w:color w:val="FFFFFF"/>
                 <w:sz w:val="20"/>
               </w:rPr>
               <w:t>Transmission</w:t>
@@ -4020,12 +4141,14 @@
         <w:tc>
           <w:tcPr>
             <w:tcW w:type="dxa" w:w="3216"/>
+            <w:shd w:val="clear" w:color="auto" w:fill="2E5A88"/>
           </w:tcPr>
           <w:p>
             <w:r/>
             <w:r>
               <w:rPr>
                 <w:b/>
+                <w:color w:val="FFFFFF"/>
                 <w:sz w:val="20"/>
               </w:rPr>
               <w:t>Mean weight (1000 lbs)</w:t>
@@ -4035,12 +4158,14 @@
         <w:tc>
           <w:tcPr>
             <w:tcW w:type="dxa" w:w="3216"/>
+            <w:shd w:val="clear" w:color="auto" w:fill="2E5A88"/>
           </w:tcPr>
           <w:p>
             <w:r/>
             <w:r>
               <w:rPr>
                 <w:b/>
+                <w:color w:val="FFFFFF"/>
                 <w:sz w:val="20"/>
               </w:rPr>
               <w:t>SD</w:t>
@@ -4108,6 +4233,7 @@
         <w:tc>
           <w:tcPr>
             <w:tcW w:type="dxa" w:w="3216"/>
+            <w:shd w:val="clear" w:color="auto" w:fill="F2F5F9"/>
           </w:tcPr>
           <w:p>
             <w:r>
@@ -4126,6 +4252,7 @@
         <w:tc>
           <w:tcPr>
             <w:tcW w:type="dxa" w:w="3216"/>
+            <w:shd w:val="clear" w:color="auto" w:fill="F2F5F9"/>
           </w:tcPr>
           <w:p>
             <w:r>
@@ -4144,6 +4271,7 @@
         <w:tc>
           <w:tcPr>
             <w:tcW w:type="dxa" w:w="3216"/>
+            <w:shd w:val="clear" w:color="auto" w:fill="F2F5F9"/>
           </w:tcPr>
           <w:p>
             <w:r>
@@ -4164,7 +4292,7 @@
     <w:p/>
     <w:tbl>
       <w:tblPr>
-        <w:tblStyle w:val="LightGrid-Accent1"/>
+        <w:tblStyle w:val="TableGrid"/>
         <w:tblW w:type="auto" w:w="0"/>
         <w:tblLook w:firstColumn="1" w:firstRow="1" w:lastColumn="0" w:lastRow="0" w:noHBand="0" w:noVBand="1" w:val="04A0"/>
       </w:tblPr>
@@ -4176,12 +4304,14 @@
         <w:tc>
           <w:tcPr>
             <w:tcW w:type="dxa" w:w="4824"/>
+            <w:shd w:val="clear" w:color="auto" w:fill="2E5A88"/>
           </w:tcPr>
           <w:p>
             <w:r/>
             <w:r>
               <w:rPr>
                 <w:b/>
+                <w:color w:val="FFFFFF"/>
                 <w:sz w:val="20"/>
               </w:rPr>
               <w:t>Test</w:t>
@@ -4191,12 +4321,14 @@
         <w:tc>
           <w:tcPr>
             <w:tcW w:type="dxa" w:w="4824"/>
+            <w:shd w:val="clear" w:color="auto" w:fill="2E5A88"/>
           </w:tcPr>
           <w:p>
             <w:r/>
             <w:r>
               <w:rPr>
                 <w:b/>
+                <w:color w:val="FFFFFF"/>
                 <w:sz w:val="20"/>
               </w:rPr>
               <w:t>p-value for transmission</w:t>
@@ -4246,6 +4378,7 @@
         <w:tc>
           <w:tcPr>
             <w:tcW w:type="dxa" w:w="4824"/>
+            <w:shd w:val="clear" w:color="auto" w:fill="F2F5F9"/>
           </w:tcPr>
           <w:p>
             <w:r>
@@ -4264,6 +4397,7 @@
         <w:tc>
           <w:tcPr>
             <w:tcW w:type="dxa" w:w="4824"/>
+            <w:shd w:val="clear" w:color="auto" w:fill="F2F5F9"/>
           </w:tcPr>
           <w:p>
             <w:r>
@@ -4395,7 +4529,7 @@
     </w:p>
     <w:tbl>
       <w:tblPr>
-        <w:tblStyle w:val="LightGrid-Accent1"/>
+        <w:tblStyle w:val="TableGrid"/>
         <w:tblW w:type="auto" w:w="0"/>
         <w:tblLook w:firstColumn="1" w:firstRow="1" w:lastColumn="0" w:lastRow="0" w:noHBand="0" w:noVBand="1" w:val="04A0"/>
       </w:tblPr>
@@ -4408,12 +4542,14 @@
         <w:tc>
           <w:tcPr>
             <w:tcW w:type="dxa" w:w="3216"/>
+            <w:shd w:val="clear" w:color="auto" w:fill="2E5A88"/>
           </w:tcPr>
           <w:p>
             <w:r/>
             <w:r>
               <w:rPr>
                 <w:b/>
+                <w:color w:val="FFFFFF"/>
                 <w:sz w:val="20"/>
               </w:rPr>
             </w:r>
@@ -4422,12 +4558,14 @@
         <w:tc>
           <w:tcPr>
             <w:tcW w:type="dxa" w:w="3216"/>
+            <w:shd w:val="clear" w:color="auto" w:fill="2E5A88"/>
           </w:tcPr>
           <w:p>
             <w:r/>
             <w:r>
               <w:rPr>
                 <w:b/>
+                <w:color w:val="FFFFFF"/>
                 <w:sz w:val="20"/>
               </w:rPr>
               <w:t>Automatic</w:t>
@@ -4437,12 +4575,14 @@
         <w:tc>
           <w:tcPr>
             <w:tcW w:type="dxa" w:w="3216"/>
+            <w:shd w:val="clear" w:color="auto" w:fill="2E5A88"/>
           </w:tcPr>
           <w:p>
             <w:r/>
             <w:r>
               <w:rPr>
                 <w:b/>
+                <w:color w:val="FFFFFF"/>
                 <w:sz w:val="20"/>
               </w:rPr>
               <w:t>Manual</w:t>
@@ -4510,6 +4650,7 @@
         <w:tc>
           <w:tcPr>
             <w:tcW w:type="dxa" w:w="3216"/>
+            <w:shd w:val="clear" w:color="auto" w:fill="F2F5F9"/>
           </w:tcPr>
           <w:p>
             <w:r>
@@ -4528,6 +4669,7 @@
         <w:tc>
           <w:tcPr>
             <w:tcW w:type="dxa" w:w="3216"/>
+            <w:shd w:val="clear" w:color="auto" w:fill="F2F5F9"/>
           </w:tcPr>
           <w:p>
             <w:r>
@@ -4546,6 +4688,7 @@
         <w:tc>
           <w:tcPr>
             <w:tcW w:type="dxa" w:w="3216"/>
+            <w:shd w:val="clear" w:color="auto" w:fill="F2F5F9"/>
           </w:tcPr>
           <w:p>
             <w:r>
@@ -4780,7 +4923,7 @@
     </w:p>
     <w:tbl>
       <w:tblPr>
-        <w:tblStyle w:val="LightGrid-Accent1"/>
+        <w:tblStyle w:val="TableGrid"/>
         <w:tblW w:type="auto" w:w="0"/>
         <w:tblLook w:firstColumn="1" w:firstRow="1" w:lastColumn="0" w:lastRow="0" w:noHBand="0" w:noVBand="1" w:val="04A0"/>
       </w:tblPr>
@@ -4793,12 +4936,14 @@
         <w:tc>
           <w:tcPr>
             <w:tcW w:type="dxa" w:w="3216"/>
+            <w:shd w:val="clear" w:color="auto" w:fill="2E5A88"/>
           </w:tcPr>
           <w:p>
             <w:r/>
             <w:r>
               <w:rPr>
                 <w:b/>
+                <w:color w:val="FFFFFF"/>
                 <w:sz w:val="20"/>
               </w:rPr>
               <w:t>Variable</w:t>
@@ -4808,12 +4953,14 @@
         <w:tc>
           <w:tcPr>
             <w:tcW w:type="dxa" w:w="3216"/>
+            <w:shd w:val="clear" w:color="auto" w:fill="2E5A88"/>
           </w:tcPr>
           <w:p>
             <w:r/>
             <w:r>
               <w:rPr>
                 <w:b/>
+                <w:color w:val="FFFFFF"/>
                 <w:sz w:val="20"/>
               </w:rPr>
               <w:t>Levels</w:t>
@@ -4823,12 +4970,14 @@
         <w:tc>
           <w:tcPr>
             <w:tcW w:type="dxa" w:w="3216"/>
+            <w:shd w:val="clear" w:color="auto" w:fill="2E5A88"/>
           </w:tcPr>
           <w:p>
             <w:r/>
             <w:r>
               <w:rPr>
                 <w:b/>
+                <w:color w:val="FFFFFF"/>
                 <w:sz w:val="20"/>
               </w:rPr>
               <w:t>Type</w:t>
@@ -4896,6 +5045,7 @@
         <w:tc>
           <w:tcPr>
             <w:tcW w:type="dxa" w:w="3216"/>
+            <w:shd w:val="clear" w:color="auto" w:fill="F2F5F9"/>
           </w:tcPr>
           <w:p>
             <w:r>
@@ -4914,6 +5064,7 @@
         <w:tc>
           <w:tcPr>
             <w:tcW w:type="dxa" w:w="3216"/>
+            <w:shd w:val="clear" w:color="auto" w:fill="F2F5F9"/>
           </w:tcPr>
           <w:p>
             <w:r>
@@ -4932,6 +5083,7 @@
         <w:tc>
           <w:tcPr>
             <w:tcW w:type="dxa" w:w="3216"/>
+            <w:shd w:val="clear" w:color="auto" w:fill="F2F5F9"/>
           </w:tcPr>
           <w:p>
             <w:r>
@@ -5008,6 +5160,7 @@
         <w:tc>
           <w:tcPr>
             <w:tcW w:type="dxa" w:w="3216"/>
+            <w:shd w:val="clear" w:color="auto" w:fill="F2F5F9"/>
           </w:tcPr>
           <w:p>
             <w:r>
@@ -5026,6 +5179,7 @@
         <w:tc>
           <w:tcPr>
             <w:tcW w:type="dxa" w:w="3216"/>
+            <w:shd w:val="clear" w:color="auto" w:fill="F2F5F9"/>
           </w:tcPr>
           <w:p>
             <w:r>
@@ -5044,6 +5198,7 @@
         <w:tc>
           <w:tcPr>
             <w:tcW w:type="dxa" w:w="3216"/>
+            <w:shd w:val="clear" w:color="auto" w:fill="F2F5F9"/>
           </w:tcPr>
           <w:p>
             <w:r>
@@ -5120,7 +5275,7 @@
     </w:p>
     <w:tbl>
       <w:tblPr>
-        <w:tblStyle w:val="LightGrid-Accent1"/>
+        <w:tblStyle w:val="TableGrid"/>
         <w:tblW w:type="auto" w:w="0"/>
         <w:tblLook w:firstColumn="1" w:firstRow="1" w:lastColumn="0" w:lastRow="0" w:noHBand="0" w:noVBand="1" w:val="04A0"/>
       </w:tblPr>
@@ -5133,12 +5288,14 @@
         <w:tc>
           <w:tcPr>
             <w:tcW w:type="dxa" w:w="3216"/>
+            <w:shd w:val="clear" w:color="auto" w:fill="2E5A88"/>
           </w:tcPr>
           <w:p>
             <w:r/>
             <w:r>
               <w:rPr>
                 <w:b/>
+                <w:color w:val="FFFFFF"/>
                 <w:sz w:val="20"/>
               </w:rPr>
             </w:r>
@@ -5147,12 +5304,14 @@
         <w:tc>
           <w:tcPr>
             <w:tcW w:type="dxa" w:w="3216"/>
+            <w:shd w:val="clear" w:color="auto" w:fill="2E5A88"/>
           </w:tcPr>
           <w:p>
             <w:r/>
             <w:r>
               <w:rPr>
                 <w:b/>
+                <w:color w:val="FFFFFF"/>
                 <w:sz w:val="20"/>
               </w:rPr>
               <w:t>Low</w:t>
@@ -5162,12 +5321,14 @@
         <w:tc>
           <w:tcPr>
             <w:tcW w:type="dxa" w:w="3216"/>
+            <w:shd w:val="clear" w:color="auto" w:fill="2E5A88"/>
           </w:tcPr>
           <w:p>
             <w:r/>
             <w:r>
               <w:rPr>
                 <w:b/>
+                <w:color w:val="FFFFFF"/>
                 <w:sz w:val="20"/>
               </w:rPr>
               <w:t>High</w:t>
@@ -5235,6 +5396,7 @@
         <w:tc>
           <w:tcPr>
             <w:tcW w:type="dxa" w:w="3216"/>
+            <w:shd w:val="clear" w:color="auto" w:fill="F2F5F9"/>
           </w:tcPr>
           <w:p>
             <w:r>
@@ -5253,6 +5415,7 @@
         <w:tc>
           <w:tcPr>
             <w:tcW w:type="dxa" w:w="3216"/>
+            <w:shd w:val="clear" w:color="auto" w:fill="F2F5F9"/>
           </w:tcPr>
           <w:p>
             <w:r>
@@ -5271,6 +5434,7 @@
         <w:tc>
           <w:tcPr>
             <w:tcW w:type="dxa" w:w="3216"/>
+            <w:shd w:val="clear" w:color="auto" w:fill="F2F5F9"/>
           </w:tcPr>
           <w:p>
             <w:r>
@@ -5361,7 +5525,7 @@
     </w:p>
     <w:tbl>
       <w:tblPr>
-        <w:tblStyle w:val="LightGrid-Accent1"/>
+        <w:tblStyle w:val="TableGrid"/>
         <w:tblW w:type="auto" w:w="0"/>
         <w:tblLook w:firstColumn="1" w:firstRow="1" w:lastColumn="0" w:lastRow="0" w:noHBand="0" w:noVBand="1" w:val="04A0"/>
       </w:tblPr>
@@ -5374,12 +5538,14 @@
         <w:tc>
           <w:tcPr>
             <w:tcW w:type="dxa" w:w="3216"/>
+            <w:shd w:val="clear" w:color="auto" w:fill="2E5A88"/>
           </w:tcPr>
           <w:p>
             <w:r/>
             <w:r>
               <w:rPr>
                 <w:b/>
+                <w:color w:val="FFFFFF"/>
                 <w:sz w:val="20"/>
               </w:rPr>
               <w:t>Block</w:t>
@@ -5389,12 +5555,14 @@
         <w:tc>
           <w:tcPr>
             <w:tcW w:type="dxa" w:w="3216"/>
+            <w:shd w:val="clear" w:color="auto" w:fill="2E5A88"/>
           </w:tcPr>
           <w:p>
             <w:r/>
             <w:r>
               <w:rPr>
                 <w:b/>
+                <w:color w:val="FFFFFF"/>
                 <w:sz w:val="20"/>
               </w:rPr>
               <w:t>Low</w:t>
@@ -5404,12 +5572,14 @@
         <w:tc>
           <w:tcPr>
             <w:tcW w:type="dxa" w:w="3216"/>
+            <w:shd w:val="clear" w:color="auto" w:fill="2E5A88"/>
           </w:tcPr>
           <w:p>
             <w:r/>
             <w:r>
               <w:rPr>
                 <w:b/>
+                <w:color w:val="FFFFFF"/>
                 <w:sz w:val="20"/>
               </w:rPr>
               <w:t>High</w:t>
@@ -5477,6 +5647,7 @@
         <w:tc>
           <w:tcPr>
             <w:tcW w:type="dxa" w:w="3216"/>
+            <w:shd w:val="clear" w:color="auto" w:fill="F2F5F9"/>
           </w:tcPr>
           <w:p>
             <w:r>
@@ -5495,6 +5666,7 @@
         <w:tc>
           <w:tcPr>
             <w:tcW w:type="dxa" w:w="3216"/>
+            <w:shd w:val="clear" w:color="auto" w:fill="F2F5F9"/>
           </w:tcPr>
           <w:p>
             <w:r>
@@ -5513,6 +5685,7 @@
         <w:tc>
           <w:tcPr>
             <w:tcW w:type="dxa" w:w="3216"/>
+            <w:shd w:val="clear" w:color="auto" w:fill="F2F5F9"/>
           </w:tcPr>
           <w:p>
             <w:r>
@@ -5589,6 +5762,7 @@
         <w:tc>
           <w:tcPr>
             <w:tcW w:type="dxa" w:w="3216"/>
+            <w:shd w:val="clear" w:color="auto" w:fill="F2F5F9"/>
           </w:tcPr>
           <w:p>
             <w:r>
@@ -5607,6 +5781,7 @@
         <w:tc>
           <w:tcPr>
             <w:tcW w:type="dxa" w:w="3216"/>
+            <w:shd w:val="clear" w:color="auto" w:fill="F2F5F9"/>
           </w:tcPr>
           <w:p>
             <w:r>
@@ -5625,6 +5800,7 @@
         <w:tc>
           <w:tcPr>
             <w:tcW w:type="dxa" w:w="3216"/>
+            <w:shd w:val="clear" w:color="auto" w:fill="F2F5F9"/>
           </w:tcPr>
           <w:p>
             <w:r>
@@ -5669,7 +5845,7 @@
     </w:p>
     <w:tbl>
       <w:tblPr>
-        <w:tblStyle w:val="LightGrid-Accent1"/>
+        <w:tblStyle w:val="TableGrid"/>
         <w:tblW w:type="auto" w:w="0"/>
         <w:tblLook w:firstColumn="1" w:firstRow="1" w:lastColumn="0" w:lastRow="0" w:noHBand="0" w:noVBand="1" w:val="04A0"/>
       </w:tblPr>
@@ -5681,12 +5857,14 @@
         <w:tc>
           <w:tcPr>
             <w:tcW w:type="dxa" w:w="4824"/>
+            <w:shd w:val="clear" w:color="auto" w:fill="2E5A88"/>
           </w:tcPr>
           <w:p>
             <w:r/>
             <w:r>
               <w:rPr>
                 <w:b/>
+                <w:color w:val="FFFFFF"/>
                 <w:sz w:val="20"/>
               </w:rPr>
               <w:t>Statistic</w:t>
@@ -5696,12 +5874,14 @@
         <w:tc>
           <w:tcPr>
             <w:tcW w:type="dxa" w:w="4824"/>
+            <w:shd w:val="clear" w:color="auto" w:fill="2E5A88"/>
           </w:tcPr>
           <w:p>
             <w:r/>
             <w:r>
               <w:rPr>
                 <w:b/>
+                <w:color w:val="FFFFFF"/>
                 <w:sz w:val="20"/>
               </w:rPr>
               <w:t>Value</w:t>
@@ -5751,6 +5931,7 @@
         <w:tc>
           <w:tcPr>
             <w:tcW w:type="dxa" w:w="4824"/>
+            <w:shd w:val="clear" w:color="auto" w:fill="F2F5F9"/>
           </w:tcPr>
           <w:p>
             <w:r>
@@ -5769,6 +5950,7 @@
         <w:tc>
           <w:tcPr>
             <w:tcW w:type="dxa" w:w="4824"/>
+            <w:shd w:val="clear" w:color="auto" w:fill="F2F5F9"/>
           </w:tcPr>
           <w:p>
             <w:r>
@@ -5827,6 +6009,7 @@
         <w:tc>
           <w:tcPr>
             <w:tcW w:type="dxa" w:w="4824"/>
+            <w:shd w:val="clear" w:color="auto" w:fill="F2F5F9"/>
           </w:tcPr>
           <w:p>
             <w:r>
@@ -5845,6 +6028,7 @@
         <w:tc>
           <w:tcPr>
             <w:tcW w:type="dxa" w:w="4824"/>
+            <w:shd w:val="clear" w:color="auto" w:fill="F2F5F9"/>
           </w:tcPr>
           <w:p>
             <w:r>
@@ -5903,6 +6087,7 @@
         <w:tc>
           <w:tcPr>
             <w:tcW w:type="dxa" w:w="4824"/>
+            <w:shd w:val="clear" w:color="auto" w:fill="F2F5F9"/>
           </w:tcPr>
           <w:p>
             <w:r>
@@ -5921,6 +6106,7 @@
         <w:tc>
           <w:tcPr>
             <w:tcW w:type="dxa" w:w="4824"/>
+            <w:shd w:val="clear" w:color="auto" w:fill="F2F5F9"/>
           </w:tcPr>
           <w:p>
             <w:r>
@@ -5979,6 +6165,7 @@
         <w:tc>
           <w:tcPr>
             <w:tcW w:type="dxa" w:w="4824"/>
+            <w:shd w:val="clear" w:color="auto" w:fill="F2F5F9"/>
           </w:tcPr>
           <w:p>
             <w:r>
@@ -5997,6 +6184,7 @@
         <w:tc>
           <w:tcPr>
             <w:tcW w:type="dxa" w:w="4824"/>
+            <w:shd w:val="clear" w:color="auto" w:fill="F2F5F9"/>
           </w:tcPr>
           <w:p>
             <w:r>
@@ -6055,6 +6243,7 @@
         <w:tc>
           <w:tcPr>
             <w:tcW w:type="dxa" w:w="4824"/>
+            <w:shd w:val="clear" w:color="auto" w:fill="F2F5F9"/>
           </w:tcPr>
           <w:p>
             <w:r>
@@ -6073,6 +6262,7 @@
         <w:tc>
           <w:tcPr>
             <w:tcW w:type="dxa" w:w="4824"/>
+            <w:shd w:val="clear" w:color="auto" w:fill="F2F5F9"/>
           </w:tcPr>
           <w:p>
             <w:r>
@@ -6131,6 +6321,7 @@
         <w:tc>
           <w:tcPr>
             <w:tcW w:type="dxa" w:w="4824"/>
+            <w:shd w:val="clear" w:color="auto" w:fill="F2F5F9"/>
           </w:tcPr>
           <w:p>
             <w:r>
@@ -6149,6 +6340,7 @@
         <w:tc>
           <w:tcPr>
             <w:tcW w:type="dxa" w:w="4824"/>
+            <w:shd w:val="clear" w:color="auto" w:fill="F2F5F9"/>
           </w:tcPr>
           <w:p>
             <w:r>
@@ -6320,7 +6512,7 @@
     </w:p>
     <w:tbl>
       <w:tblPr>
-        <w:tblStyle w:val="LightGrid-Accent1"/>
+        <w:tblStyle w:val="TableGrid"/>
         <w:tblW w:type="auto" w:w="0"/>
         <w:tblLook w:firstColumn="1" w:firstRow="1" w:lastColumn="0" w:lastRow="0" w:noHBand="0" w:noVBand="1" w:val="04A0"/>
       </w:tblPr>
@@ -6336,12 +6528,14 @@
         <w:tc>
           <w:tcPr>
             <w:tcW w:type="dxa" w:w="1608"/>
+            <w:shd w:val="clear" w:color="auto" w:fill="2E5A88"/>
           </w:tcPr>
           <w:p>
             <w:r/>
             <w:r>
               <w:rPr>
                 <w:b/>
+                <w:color w:val="FFFFFF"/>
                 <w:sz w:val="20"/>
               </w:rPr>
               <w:t>Group</w:t>
@@ -6351,12 +6545,14 @@
         <w:tc>
           <w:tcPr>
             <w:tcW w:type="dxa" w:w="1608"/>
+            <w:shd w:val="clear" w:color="auto" w:fill="2E5A88"/>
           </w:tcPr>
           <w:p>
             <w:r/>
             <w:r>
               <w:rPr>
                 <w:b/>
+                <w:color w:val="FFFFFF"/>
                 <w:sz w:val="20"/>
               </w:rPr>
               <w:t>Mean</w:t>
@@ -6366,12 +6562,14 @@
         <w:tc>
           <w:tcPr>
             <w:tcW w:type="dxa" w:w="1608"/>
+            <w:shd w:val="clear" w:color="auto" w:fill="2E5A88"/>
           </w:tcPr>
           <w:p>
             <w:r/>
             <w:r>
               <w:rPr>
                 <w:b/>
+                <w:color w:val="FFFFFF"/>
                 <w:sz w:val="20"/>
               </w:rPr>
               <w:t>SD</w:t>
@@ -6381,12 +6579,14 @@
         <w:tc>
           <w:tcPr>
             <w:tcW w:type="dxa" w:w="1608"/>
+            <w:shd w:val="clear" w:color="auto" w:fill="2E5A88"/>
           </w:tcPr>
           <w:p>
             <w:r/>
             <w:r>
               <w:rPr>
                 <w:b/>
+                <w:color w:val="FFFFFF"/>
                 <w:sz w:val="20"/>
               </w:rPr>
               <w:t>Min</w:t>
@@ -6396,12 +6596,14 @@
         <w:tc>
           <w:tcPr>
             <w:tcW w:type="dxa" w:w="1608"/>
+            <w:shd w:val="clear" w:color="auto" w:fill="2E5A88"/>
           </w:tcPr>
           <w:p>
             <w:r/>
             <w:r>
               <w:rPr>
                 <w:b/>
+                <w:color w:val="FFFFFF"/>
                 <w:sz w:val="20"/>
               </w:rPr>
               <w:t>Max</w:t>
@@ -6411,12 +6613,14 @@
         <w:tc>
           <w:tcPr>
             <w:tcW w:type="dxa" w:w="1608"/>
+            <w:shd w:val="clear" w:color="auto" w:fill="2E5A88"/>
           </w:tcPr>
           <w:p>
             <w:r/>
             <w:r>
               <w:rPr>
                 <w:b/>
+                <w:color w:val="FFFFFF"/>
                 <w:sz w:val="20"/>
               </w:rPr>
               <w:t>n</w:t>
@@ -6538,6 +6742,7 @@
         <w:tc>
           <w:tcPr>
             <w:tcW w:type="dxa" w:w="1608"/>
+            <w:shd w:val="clear" w:color="auto" w:fill="F2F5F9"/>
           </w:tcPr>
           <w:p>
             <w:r>
@@ -6556,6 +6761,7 @@
         <w:tc>
           <w:tcPr>
             <w:tcW w:type="dxa" w:w="1608"/>
+            <w:shd w:val="clear" w:color="auto" w:fill="F2F5F9"/>
           </w:tcPr>
           <w:p>
             <w:r>
@@ -6574,6 +6780,7 @@
         <w:tc>
           <w:tcPr>
             <w:tcW w:type="dxa" w:w="1608"/>
+            <w:shd w:val="clear" w:color="auto" w:fill="F2F5F9"/>
           </w:tcPr>
           <w:p>
             <w:r>
@@ -6592,6 +6799,7 @@
         <w:tc>
           <w:tcPr>
             <w:tcW w:type="dxa" w:w="1608"/>
+            <w:shd w:val="clear" w:color="auto" w:fill="F2F5F9"/>
           </w:tcPr>
           <w:p>
             <w:r>
@@ -6610,6 +6818,7 @@
         <w:tc>
           <w:tcPr>
             <w:tcW w:type="dxa" w:w="1608"/>
+            <w:shd w:val="clear" w:color="auto" w:fill="F2F5F9"/>
           </w:tcPr>
           <w:p>
             <w:r>
@@ -6628,6 +6837,7 @@
         <w:tc>
           <w:tcPr>
             <w:tcW w:type="dxa" w:w="1608"/>
+            <w:shd w:val="clear" w:color="auto" w:fill="F2F5F9"/>
           </w:tcPr>
           <w:p>
             <w:r>
@@ -6758,6 +6968,7 @@
         <w:tc>
           <w:tcPr>
             <w:tcW w:type="dxa" w:w="1608"/>
+            <w:shd w:val="clear" w:color="auto" w:fill="F2F5F9"/>
           </w:tcPr>
           <w:p>
             <w:r>
@@ -6776,6 +6987,7 @@
         <w:tc>
           <w:tcPr>
             <w:tcW w:type="dxa" w:w="1608"/>
+            <w:shd w:val="clear" w:color="auto" w:fill="F2F5F9"/>
           </w:tcPr>
           <w:p>
             <w:r>
@@ -6794,6 +7006,7 @@
         <w:tc>
           <w:tcPr>
             <w:tcW w:type="dxa" w:w="1608"/>
+            <w:shd w:val="clear" w:color="auto" w:fill="F2F5F9"/>
           </w:tcPr>
           <w:p>
             <w:r>
@@ -6812,6 +7025,7 @@
         <w:tc>
           <w:tcPr>
             <w:tcW w:type="dxa" w:w="1608"/>
+            <w:shd w:val="clear" w:color="auto" w:fill="F2F5F9"/>
           </w:tcPr>
           <w:p>
             <w:r>
@@ -6830,6 +7044,7 @@
         <w:tc>
           <w:tcPr>
             <w:tcW w:type="dxa" w:w="1608"/>
+            <w:shd w:val="clear" w:color="auto" w:fill="F2F5F9"/>
           </w:tcPr>
           <w:p>
             <w:r>
@@ -6848,6 +7063,7 @@
         <w:tc>
           <w:tcPr>
             <w:tcW w:type="dxa" w:w="1608"/>
+            <w:shd w:val="clear" w:color="auto" w:fill="F2F5F9"/>
           </w:tcPr>
           <w:p>
             <w:r>
@@ -6978,6 +7194,7 @@
         <w:tc>
           <w:tcPr>
             <w:tcW w:type="dxa" w:w="1608"/>
+            <w:shd w:val="clear" w:color="auto" w:fill="F2F5F9"/>
           </w:tcPr>
           <w:p>
             <w:r>
@@ -6996,6 +7213,7 @@
         <w:tc>
           <w:tcPr>
             <w:tcW w:type="dxa" w:w="1608"/>
+            <w:shd w:val="clear" w:color="auto" w:fill="F2F5F9"/>
           </w:tcPr>
           <w:p>
             <w:r>
@@ -7014,6 +7232,7 @@
         <w:tc>
           <w:tcPr>
             <w:tcW w:type="dxa" w:w="1608"/>
+            <w:shd w:val="clear" w:color="auto" w:fill="F2F5F9"/>
           </w:tcPr>
           <w:p>
             <w:r>
@@ -7032,6 +7251,7 @@
         <w:tc>
           <w:tcPr>
             <w:tcW w:type="dxa" w:w="1608"/>
+            <w:shd w:val="clear" w:color="auto" w:fill="F2F5F9"/>
           </w:tcPr>
           <w:p>
             <w:r>
@@ -7044,6 +7264,7 @@
         <w:tc>
           <w:tcPr>
             <w:tcW w:type="dxa" w:w="1608"/>
+            <w:shd w:val="clear" w:color="auto" w:fill="F2F5F9"/>
           </w:tcPr>
           <w:p>
             <w:r>
@@ -7056,6 +7277,7 @@
         <w:tc>
           <w:tcPr>
             <w:tcW w:type="dxa" w:w="1608"/>
+            <w:shd w:val="clear" w:color="auto" w:fill="F2F5F9"/>
           </w:tcPr>
           <w:p>
             <w:r>
@@ -7174,6 +7396,7 @@
         <w:tc>
           <w:tcPr>
             <w:tcW w:type="dxa" w:w="1608"/>
+            <w:shd w:val="clear" w:color="auto" w:fill="F2F5F9"/>
           </w:tcPr>
           <w:p>
             <w:r>
@@ -7192,6 +7415,7 @@
         <w:tc>
           <w:tcPr>
             <w:tcW w:type="dxa" w:w="1608"/>
+            <w:shd w:val="clear" w:color="auto" w:fill="F2F5F9"/>
           </w:tcPr>
           <w:p>
             <w:r>
@@ -7210,6 +7434,7 @@
         <w:tc>
           <w:tcPr>
             <w:tcW w:type="dxa" w:w="1608"/>
+            <w:shd w:val="clear" w:color="auto" w:fill="F2F5F9"/>
           </w:tcPr>
           <w:p>
             <w:r>
@@ -7228,6 +7453,7 @@
         <w:tc>
           <w:tcPr>
             <w:tcW w:type="dxa" w:w="1608"/>
+            <w:shd w:val="clear" w:color="auto" w:fill="F2F5F9"/>
           </w:tcPr>
           <w:p>
             <w:r>
@@ -7240,6 +7466,7 @@
         <w:tc>
           <w:tcPr>
             <w:tcW w:type="dxa" w:w="1608"/>
+            <w:shd w:val="clear" w:color="auto" w:fill="F2F5F9"/>
           </w:tcPr>
           <w:p>
             <w:r>
@@ -7252,6 +7479,7 @@
         <w:tc>
           <w:tcPr>
             <w:tcW w:type="dxa" w:w="1608"/>
+            <w:shd w:val="clear" w:color="auto" w:fill="F2F5F9"/>
           </w:tcPr>
           <w:p>
             <w:r>
@@ -7417,7 +7645,7 @@
     </w:p>
     <w:tbl>
       <w:tblPr>
-        <w:tblStyle w:val="LightGrid-Accent1"/>
+        <w:tblStyle w:val="TableGrid"/>
         <w:tblW w:type="auto" w:w="0"/>
         <w:tblLook w:firstColumn="1" w:firstRow="1" w:lastColumn="0" w:lastRow="0" w:noHBand="0" w:noVBand="1" w:val="04A0"/>
       </w:tblPr>
@@ -7431,12 +7659,14 @@
         <w:tc>
           <w:tcPr>
             <w:tcW w:type="dxa" w:w="2412"/>
+            <w:shd w:val="clear" w:color="auto" w:fill="2E5A88"/>
           </w:tcPr>
           <w:p>
             <w:r/>
             <w:r>
               <w:rPr>
                 <w:b/>
+                <w:color w:val="FFFFFF"/>
                 <w:sz w:val="20"/>
               </w:rPr>
               <w:t>Comparison</w:t>
@@ -7446,12 +7676,14 @@
         <w:tc>
           <w:tcPr>
             <w:tcW w:type="dxa" w:w="2412"/>
+            <w:shd w:val="clear" w:color="auto" w:fill="2E5A88"/>
           </w:tcPr>
           <w:p>
             <w:r/>
             <w:r>
               <w:rPr>
                 <w:b/>
+                <w:color w:val="FFFFFF"/>
                 <w:sz w:val="20"/>
               </w:rPr>
               <w:t>Difference (bushels)</w:t>
@@ -7461,12 +7693,14 @@
         <w:tc>
           <w:tcPr>
             <w:tcW w:type="dxa" w:w="2412"/>
+            <w:shd w:val="clear" w:color="auto" w:fill="2E5A88"/>
           </w:tcPr>
           <w:p>
             <w:r/>
             <w:r>
               <w:rPr>
                 <w:b/>
+                <w:color w:val="FFFFFF"/>
                 <w:sz w:val="20"/>
               </w:rPr>
               <w:t>Percent</w:t>
@@ -7476,12 +7710,14 @@
         <w:tc>
           <w:tcPr>
             <w:tcW w:type="dxa" w:w="2412"/>
+            <w:shd w:val="clear" w:color="auto" w:fill="2E5A88"/>
           </w:tcPr>
           <w:p>
             <w:r/>
             <w:r>
               <w:rPr>
                 <w:b/>
+                <w:color w:val="FFFFFF"/>
                 <w:sz w:val="20"/>
               </w:rPr>
               <w:t>In SD units</w:t>
@@ -7567,6 +7803,7 @@
         <w:tc>
           <w:tcPr>
             <w:tcW w:type="dxa" w:w="2412"/>
+            <w:shd w:val="clear" w:color="auto" w:fill="F2F5F9"/>
           </w:tcPr>
           <w:p>
             <w:r>
@@ -7585,6 +7822,7 @@
         <w:tc>
           <w:tcPr>
             <w:tcW w:type="dxa" w:w="2412"/>
+            <w:shd w:val="clear" w:color="auto" w:fill="F2F5F9"/>
           </w:tcPr>
           <w:p>
             <w:r>
@@ -7603,6 +7841,7 @@
         <w:tc>
           <w:tcPr>
             <w:tcW w:type="dxa" w:w="2412"/>
+            <w:shd w:val="clear" w:color="auto" w:fill="F2F5F9"/>
           </w:tcPr>
           <w:p>
             <w:r>
@@ -7621,6 +7860,7 @@
         <w:tc>
           <w:tcPr>
             <w:tcW w:type="dxa" w:w="2412"/>
+            <w:shd w:val="clear" w:color="auto" w:fill="F2F5F9"/>
           </w:tcPr>
           <w:p>
             <w:r>
@@ -7715,6 +7955,7 @@
         <w:tc>
           <w:tcPr>
             <w:tcW w:type="dxa" w:w="2412"/>
+            <w:shd w:val="clear" w:color="auto" w:fill="F2F5F9"/>
           </w:tcPr>
           <w:p>
             <w:r>
@@ -7733,6 +7974,7 @@
         <w:tc>
           <w:tcPr>
             <w:tcW w:type="dxa" w:w="2412"/>
+            <w:shd w:val="clear" w:color="auto" w:fill="F2F5F9"/>
           </w:tcPr>
           <w:p>
             <w:r>
@@ -7751,6 +7993,7 @@
         <w:tc>
           <w:tcPr>
             <w:tcW w:type="dxa" w:w="2412"/>
+            <w:shd w:val="clear" w:color="auto" w:fill="F2F5F9"/>
           </w:tcPr>
           <w:p>
             <w:r>
@@ -7769,6 +8012,7 @@
         <w:tc>
           <w:tcPr>
             <w:tcW w:type="dxa" w:w="2412"/>
+            <w:shd w:val="clear" w:color="auto" w:fill="F2F5F9"/>
           </w:tcPr>
           <w:p>
             <w:r>
@@ -7868,7 +8112,7 @@
     </w:p>
     <w:tbl>
       <w:tblPr>
-        <w:tblStyle w:val="LightGrid-Accent1"/>
+        <w:tblStyle w:val="TableGrid"/>
         <w:tblW w:type="auto" w:w="0"/>
         <w:tblLook w:firstColumn="1" w:firstRow="1" w:lastColumn="0" w:lastRow="0" w:noHBand="0" w:noVBand="1" w:val="04A0"/>
       </w:tblPr>
@@ -7882,12 +8126,14 @@
         <w:tc>
           <w:tcPr>
             <w:tcW w:type="dxa" w:w="2412"/>
+            <w:shd w:val="clear" w:color="auto" w:fill="2E5A88"/>
           </w:tcPr>
           <w:p>
             <w:r/>
             <w:r>
               <w:rPr>
                 <w:b/>
+                <w:color w:val="FFFFFF"/>
                 <w:sz w:val="20"/>
               </w:rPr>
             </w:r>
@@ -7896,12 +8142,14 @@
         <w:tc>
           <w:tcPr>
             <w:tcW w:type="dxa" w:w="2412"/>
+            <w:shd w:val="clear" w:color="auto" w:fill="2E5A88"/>
           </w:tcPr>
           <w:p>
             <w:r/>
             <w:r>
               <w:rPr>
                 <w:b/>
+                <w:color w:val="FFFFFF"/>
                 <w:sz w:val="20"/>
               </w:rPr>
               <w:t>Low</w:t>
@@ -7911,12 +8159,14 @@
         <w:tc>
           <w:tcPr>
             <w:tcW w:type="dxa" w:w="2412"/>
+            <w:shd w:val="clear" w:color="auto" w:fill="2E5A88"/>
           </w:tcPr>
           <w:p>
             <w:r/>
             <w:r>
               <w:rPr>
                 <w:b/>
+                <w:color w:val="FFFFFF"/>
                 <w:sz w:val="20"/>
               </w:rPr>
               <w:t>High</w:t>
@@ -7926,12 +8176,14 @@
         <w:tc>
           <w:tcPr>
             <w:tcW w:type="dxa" w:w="2412"/>
+            <w:shd w:val="clear" w:color="auto" w:fill="2E5A88"/>
           </w:tcPr>
           <w:p>
             <w:r/>
             <w:r>
               <w:rPr>
                 <w:b/>
+                <w:color w:val="FFFFFF"/>
                 <w:sz w:val="20"/>
               </w:rPr>
               <w:t>Density gain</w:t>
@@ -8017,6 +8269,7 @@
         <w:tc>
           <w:tcPr>
             <w:tcW w:type="dxa" w:w="2412"/>
+            <w:shd w:val="clear" w:color="auto" w:fill="F2F5F9"/>
           </w:tcPr>
           <w:p>
             <w:r>
@@ -8035,6 +8288,7 @@
         <w:tc>
           <w:tcPr>
             <w:tcW w:type="dxa" w:w="2412"/>
+            <w:shd w:val="clear" w:color="auto" w:fill="F2F5F9"/>
           </w:tcPr>
           <w:p>
             <w:r>
@@ -8053,6 +8307,7 @@
         <w:tc>
           <w:tcPr>
             <w:tcW w:type="dxa" w:w="2412"/>
+            <w:shd w:val="clear" w:color="auto" w:fill="F2F5F9"/>
           </w:tcPr>
           <w:p>
             <w:r>
@@ -8071,6 +8326,7 @@
         <w:tc>
           <w:tcPr>
             <w:tcW w:type="dxa" w:w="2412"/>
+            <w:shd w:val="clear" w:color="auto" w:fill="F2F5F9"/>
           </w:tcPr>
           <w:p>
             <w:r>
@@ -8253,7 +8509,7 @@
     </w:p>
     <w:tbl>
       <w:tblPr>
-        <w:tblStyle w:val="LightGrid-Accent1"/>
+        <w:tblStyle w:val="TableGrid"/>
         <w:tblW w:type="auto" w:w="0"/>
         <w:tblLook w:firstColumn="1" w:firstRow="1" w:lastColumn="0" w:lastRow="0" w:noHBand="0" w:noVBand="1" w:val="04A0"/>
       </w:tblPr>
@@ -8267,12 +8523,14 @@
         <w:tc>
           <w:tcPr>
             <w:tcW w:type="dxa" w:w="2412"/>
+            <w:shd w:val="clear" w:color="auto" w:fill="2E5A88"/>
           </w:tcPr>
           <w:p>
             <w:r/>
             <w:r>
               <w:rPr>
                 <w:b/>
+                <w:color w:val="FFFFFF"/>
                 <w:sz w:val="20"/>
               </w:rPr>
               <w:t>Rank</w:t>
@@ -8282,12 +8540,14 @@
         <w:tc>
           <w:tcPr>
             <w:tcW w:type="dxa" w:w="2412"/>
+            <w:shd w:val="clear" w:color="auto" w:fill="2E5A88"/>
           </w:tcPr>
           <w:p>
             <w:r/>
             <w:r>
               <w:rPr>
                 <w:b/>
+                <w:color w:val="FFFFFF"/>
                 <w:sz w:val="20"/>
               </w:rPr>
               <w:t>Fertilizer</w:t>
@@ -8297,12 +8557,14 @@
         <w:tc>
           <w:tcPr>
             <w:tcW w:type="dxa" w:w="2412"/>
+            <w:shd w:val="clear" w:color="auto" w:fill="2E5A88"/>
           </w:tcPr>
           <w:p>
             <w:r/>
             <w:r>
               <w:rPr>
                 <w:b/>
+                <w:color w:val="FFFFFF"/>
                 <w:sz w:val="20"/>
               </w:rPr>
               <w:t>Density</w:t>
@@ -8312,12 +8574,14 @@
         <w:tc>
           <w:tcPr>
             <w:tcW w:type="dxa" w:w="2412"/>
+            <w:shd w:val="clear" w:color="auto" w:fill="2E5A88"/>
           </w:tcPr>
           <w:p>
             <w:r/>
             <w:r>
               <w:rPr>
                 <w:b/>
+                <w:color w:val="FFFFFF"/>
                 <w:sz w:val="20"/>
               </w:rPr>
               <w:t>Mean yield</w:t>
@@ -8403,6 +8667,7 @@
         <w:tc>
           <w:tcPr>
             <w:tcW w:type="dxa" w:w="2412"/>
+            <w:shd w:val="clear" w:color="auto" w:fill="F2F5F9"/>
           </w:tcPr>
           <w:p>
             <w:r>
@@ -8421,6 +8686,7 @@
         <w:tc>
           <w:tcPr>
             <w:tcW w:type="dxa" w:w="2412"/>
+            <w:shd w:val="clear" w:color="auto" w:fill="F2F5F9"/>
           </w:tcPr>
           <w:p>
             <w:r>
@@ -8439,6 +8705,7 @@
         <w:tc>
           <w:tcPr>
             <w:tcW w:type="dxa" w:w="2412"/>
+            <w:shd w:val="clear" w:color="auto" w:fill="F2F5F9"/>
           </w:tcPr>
           <w:p>
             <w:r>
@@ -8457,6 +8724,7 @@
         <w:tc>
           <w:tcPr>
             <w:tcW w:type="dxa" w:w="2412"/>
+            <w:shd w:val="clear" w:color="auto" w:fill="F2F5F9"/>
           </w:tcPr>
           <w:p>
             <w:r>
@@ -8551,6 +8819,7 @@
         <w:tc>
           <w:tcPr>
             <w:tcW w:type="dxa" w:w="2412"/>
+            <w:shd w:val="clear" w:color="auto" w:fill="F2F5F9"/>
           </w:tcPr>
           <w:p>
             <w:r>
@@ -8569,6 +8838,7 @@
         <w:tc>
           <w:tcPr>
             <w:tcW w:type="dxa" w:w="2412"/>
+            <w:shd w:val="clear" w:color="auto" w:fill="F2F5F9"/>
           </w:tcPr>
           <w:p>
             <w:r>
@@ -8587,6 +8857,7 @@
         <w:tc>
           <w:tcPr>
             <w:tcW w:type="dxa" w:w="2412"/>
+            <w:shd w:val="clear" w:color="auto" w:fill="F2F5F9"/>
           </w:tcPr>
           <w:p>
             <w:r>
@@ -8605,6 +8876,7 @@
         <w:tc>
           <w:tcPr>
             <w:tcW w:type="dxa" w:w="2412"/>
+            <w:shd w:val="clear" w:color="auto" w:fill="F2F5F9"/>
           </w:tcPr>
           <w:p>
             <w:r>
@@ -8699,6 +8971,7 @@
         <w:tc>
           <w:tcPr>
             <w:tcW w:type="dxa" w:w="2412"/>
+            <w:shd w:val="clear" w:color="auto" w:fill="F2F5F9"/>
           </w:tcPr>
           <w:p>
             <w:r>
@@ -8717,6 +8990,7 @@
         <w:tc>
           <w:tcPr>
             <w:tcW w:type="dxa" w:w="2412"/>
+            <w:shd w:val="clear" w:color="auto" w:fill="F2F5F9"/>
           </w:tcPr>
           <w:p>
             <w:r>
@@ -8735,6 +9009,7 @@
         <w:tc>
           <w:tcPr>
             <w:tcW w:type="dxa" w:w="2412"/>
+            <w:shd w:val="clear" w:color="auto" w:fill="F2F5F9"/>
           </w:tcPr>
           <w:p>
             <w:r>
@@ -8753,6 +9028,7 @@
         <w:tc>
           <w:tcPr>
             <w:tcW w:type="dxa" w:w="2412"/>
+            <w:shd w:val="clear" w:color="auto" w:fill="F2F5F9"/>
           </w:tcPr>
           <w:p>
             <w:r>
@@ -8986,7 +9262,7 @@
     </w:p>
     <w:tbl>
       <w:tblPr>
-        <w:tblStyle w:val="LightGrid-Accent1"/>
+        <w:tblStyle w:val="TableGrid"/>
         <w:tblW w:type="auto" w:w="0"/>
         <w:tblLook w:firstColumn="1" w:firstRow="1" w:lastColumn="0" w:lastRow="0" w:noHBand="0" w:noVBand="1" w:val="04A0"/>
       </w:tblPr>
@@ -8999,12 +9275,14 @@
         <w:tc>
           <w:tcPr>
             <w:tcW w:type="dxa" w:w="3216"/>
+            <w:shd w:val="clear" w:color="auto" w:fill="2E5A88"/>
           </w:tcPr>
           <w:p>
             <w:r/>
             <w:r>
               <w:rPr>
                 <w:b/>
+                <w:color w:val="FFFFFF"/>
                 <w:sz w:val="20"/>
               </w:rPr>
             </w:r>
@@ -9013,12 +9291,14 @@
         <w:tc>
           <w:tcPr>
             <w:tcW w:type="dxa" w:w="3216"/>
+            <w:shd w:val="clear" w:color="auto" w:fill="2E5A88"/>
           </w:tcPr>
           <w:p>
             <w:r/>
             <w:r>
               <w:rPr>
                 <w:b/>
+                <w:color w:val="FFFFFF"/>
                 <w:sz w:val="20"/>
               </w:rPr>
               <w:t>Cars (Task 1)</w:t>
@@ -9028,12 +9308,14 @@
         <w:tc>
           <w:tcPr>
             <w:tcW w:type="dxa" w:w="3216"/>
+            <w:shd w:val="clear" w:color="auto" w:fill="2E5A88"/>
           </w:tcPr>
           <w:p>
             <w:r/>
             <w:r>
               <w:rPr>
                 <w:b/>
+                <w:color w:val="FFFFFF"/>
                 <w:sz w:val="20"/>
               </w:rPr>
               <w:t>Crop yield (Task 2)</w:t>
@@ -9101,6 +9383,7 @@
         <w:tc>
           <w:tcPr>
             <w:tcW w:type="dxa" w:w="3216"/>
+            <w:shd w:val="clear" w:color="auto" w:fill="F2F5F9"/>
           </w:tcPr>
           <w:p>
             <w:r>
@@ -9119,6 +9402,7 @@
         <w:tc>
           <w:tcPr>
             <w:tcW w:type="dxa" w:w="3216"/>
+            <w:shd w:val="clear" w:color="auto" w:fill="F2F5F9"/>
           </w:tcPr>
           <w:p>
             <w:r>
@@ -9137,6 +9421,7 @@
         <w:tc>
           <w:tcPr>
             <w:tcW w:type="dxa" w:w="3216"/>
+            <w:shd w:val="clear" w:color="auto" w:fill="F2F5F9"/>
           </w:tcPr>
           <w:p>
             <w:r>
@@ -9213,6 +9498,7 @@
         <w:tc>
           <w:tcPr>
             <w:tcW w:type="dxa" w:w="3216"/>
+            <w:shd w:val="clear" w:color="auto" w:fill="F2F5F9"/>
           </w:tcPr>
           <w:p>
             <w:r>
@@ -9231,6 +9517,7 @@
         <w:tc>
           <w:tcPr>
             <w:tcW w:type="dxa" w:w="3216"/>
+            <w:shd w:val="clear" w:color="auto" w:fill="F2F5F9"/>
           </w:tcPr>
           <w:p>
             <w:r>
@@ -9249,6 +9536,7 @@
         <w:tc>
           <w:tcPr>
             <w:tcW w:type="dxa" w:w="3216"/>
+            <w:shd w:val="clear" w:color="auto" w:fill="F2F5F9"/>
           </w:tcPr>
           <w:p>
             <w:r>
@@ -9325,6 +9613,7 @@
         <w:tc>
           <w:tcPr>
             <w:tcW w:type="dxa" w:w="3216"/>
+            <w:shd w:val="clear" w:color="auto" w:fill="F2F5F9"/>
           </w:tcPr>
           <w:p>
             <w:r>
@@ -9343,6 +9632,7 @@
         <w:tc>
           <w:tcPr>
             <w:tcW w:type="dxa" w:w="3216"/>
+            <w:shd w:val="clear" w:color="auto" w:fill="F2F5F9"/>
           </w:tcPr>
           <w:p>
             <w:r>
@@ -9361,6 +9651,7 @@
         <w:tc>
           <w:tcPr>
             <w:tcW w:type="dxa" w:w="3216"/>
+            <w:shd w:val="clear" w:color="auto" w:fill="F2F5F9"/>
           </w:tcPr>
           <w:p>
             <w:r>

</xml_diff>